<commit_message>
Complete reproducibility package and release manifests
</commit_message>
<xml_diff>
--- a/results/report.docx
+++ b/results/report.docx
@@ -8,7 +8,7 @@
         <w:jc w:val="center"/>
       </w:pPr>
       <w:r>
-        <w:t>ADAR2 NES SD40 Linker 设计中期结果全量整理</w:t>
+        <w:t>ADAR2 NES SD40 Linker 计算结果汇总</w:t>
       </w:r>
     </w:p>
     <w:p>
@@ -40,7 +40,7 @@
     </w:p>
     <w:p>
       <w:r>
-        <w:t>本次整理覆盖匿名提交包中的 13,011 条来源记录及匿名归档根目录结果文件。在线 MMseqs2 批次共获得 292 条去重 ProteinMPNN 设计序列，完成 588 个 Boltz-2 模型预测。采用 Linker Cα RMSD 严格小于 2.0 Å、至少 2/3 模型通过，以及 Vina 最佳分数不高于 -6.0 kcal/mol、至少 2/3 模型通过的门控。</w:t>
+        <w:t>本次整理覆盖匿名提交包中的 13,013 条来源记录及归档中的补充结果文件。在线 MMseqs2 批次共获得 292 条去重 ProteinMPNN 设计序列，完成 588 个 Boltz-2 模型预测。采用 Linker Cα RMSD 严格小于 2.0 Å、至少 2/3 模型通过，以及 Vina 最佳分数不高于 -6.0 kcal/mol、至少 2/3 模型通过的门控。</w:t>
       </w:r>
     </w:p>
     <w:p>
@@ -128,7 +128,7 @@
     </w:p>
     <w:p>
       <w:r>
-        <w:t>匿名包的 VALIDATION_REPORT 状态为 PASS；在线批次 11–20 Å 均包含 RFdiffusion、ProteinMPNN、序列 QC、Boltz-2、Linker RMSD、Vina 和 Ranker 阶段。根目录两份 XLSX 与包内副本哈希一致。全部大体积结构、MSA 和日志文件未复制到派生目录，而是通过相对路径、大小、SHA256、阶段和用途写入全量来源索引。</w:t>
+        <w:t>匿名包的 VALIDATION_REPORT 状态为 PASS；在线批次 11–20 Å 均包含 RFdiffusion、ProteinMPNN、序列 QC、Boltz-2、Linker RMSD、Vina 和 Ranker 阶段。归档中的两份补充 XLSX 与包内副本哈希一致。全部大体积结构、MSA 和日志文件通过相对路径、大小、SHA256、阶段和用途写入全量来源索引，并作为 GitHub Release 的分卷复现附件提供。</w:t>
       </w:r>
     </w:p>
     <w:tbl>
@@ -550,7 +550,7 @@
                 <w:b w:val="0"/>
                 <w:sz w:val="17"/>
               </w:rPr>
-              <w:t>1459</w:t>
+              <w:t>1461</w:t>
             </w:r>
           </w:p>
         </w:tc>
@@ -568,7 +568,7 @@
                 <w:b w:val="0"/>
                 <w:sz w:val="17"/>
               </w:rPr>
-              <w:t>4.78</w:t>
+              <w:t>4.88</w:t>
             </w:r>
           </w:p>
         </w:tc>
@@ -6218,7 +6218,7 @@
     </w:p>
     <w:p>
       <w:r>
-        <w:t>本报告的主表和图均由匿名化全量结果档案重建。完整相对路径和 SHA256 位于 06_全量来源索引；解析后的候选级与模型级数据位于 02_核心数据表和 04_补充表与补充图。轻量展示目录只包含派生表、图和方法说明，不包含大型 A3M、NPZ、压缩包或模型缓存。</w:t>
+        <w:t>本报告的主表和图均由匿名化全量结果档案重建。主仓库提供可直接浏览的报告、表格、图、最终结构、代码与关键日志；GitHub Release 提供 11 个完整复现分卷及统一 SHA256 清单。完整相对路径和 SHA256 位于 06_全量来源索引。第三方预训练权重、Conda 环境和软件缓存不随提交包分发，应按官方来源另行获取。</w:t>
       </w:r>
     </w:p>
     <w:p>

</xml_diff>